<commit_message>
Multiple updates: stubbed analytics for testing, marketing screenshots refresh, Windows platform support, audio recording improvements, mock services for preview mode
</commit_message>
<xml_diff>
--- a/מהי האשש.docx
+++ b/מהי האשש.docx
@@ -1414,6 +1414,725 @@
           <w:rtl/>
         </w:rPr>
       </w:pPr>
+    </w:p>
+    <w:p>
+      <w:pPr>
+        <w:pStyle w:val="ae"/>
+        <w:bidi/>
+        <w:rPr>
+          <w:sz w:val="32"/>
+          <w:szCs w:val="32"/>
+        </w:rPr>
+      </w:pPr>
+      <w:r>
+        <w:rPr>
+          <w:rFonts w:hint="cs"/>
+          <w:sz w:val="32"/>
+          <w:szCs w:val="32"/>
+          <w:rtl/>
+        </w:rPr>
+        <w:t>מה קורה כשהגבתי להאשש והתרחקתי מהמקום?</w:t>
+      </w:r>
+      <w:r>
+        <w:rPr>
+          <w:sz w:val="32"/>
+          <w:szCs w:val="32"/>
+          <w:rtl/>
+        </w:rPr>
+        <w:br/>
+      </w:r>
+      <w:r>
+        <w:rPr>
+          <w:sz w:val="32"/>
+          <w:szCs w:val="32"/>
+          <w:rtl/>
+        </w:rPr>
+        <w:br/>
+      </w:r>
+      <w:r>
+        <w:rPr>
+          <w:sz w:val="32"/>
+          <w:szCs w:val="32"/>
+          <w:rtl/>
+        </w:rPr>
+        <w:t>על פי הקוד, המצב שייווצר מעניין מאוד ומחולק ל-2 חלקים</w:t>
+      </w:r>
+      <w:r>
+        <w:rPr>
+          <w:sz w:val="32"/>
+          <w:szCs w:val="32"/>
+        </w:rPr>
+        <w:t>: </w:t>
+      </w:r>
+      <w:r>
+        <w:rPr>
+          <w:b/>
+          <w:bCs/>
+          <w:sz w:val="32"/>
+          <w:szCs w:val="32"/>
+          <w:rtl/>
+        </w:rPr>
+        <w:t>התוכן המקורי</w:t>
+      </w:r>
+      <w:r>
+        <w:rPr>
+          <w:sz w:val="32"/>
+          <w:szCs w:val="32"/>
+          <w:rtl/>
+        </w:rPr>
+        <w:t> ו</w:t>
+      </w:r>
+      <w:r>
+        <w:rPr>
+          <w:b/>
+          <w:bCs/>
+          <w:sz w:val="32"/>
+          <w:szCs w:val="32"/>
+          <w:rtl/>
+        </w:rPr>
+        <w:t>מערכת התגובות</w:t>
+      </w:r>
+      <w:r>
+        <w:rPr>
+          <w:sz w:val="32"/>
+          <w:szCs w:val="32"/>
+        </w:rPr>
+        <w:t>.</w:t>
+      </w:r>
+    </w:p>
+    <w:p>
+      <w:pPr>
+        <w:pStyle w:val="ae"/>
+        <w:numPr>
+          <w:ilvl w:val="0"/>
+          <w:numId w:val="1"/>
+        </w:numPr>
+        <w:bidi/>
+        <w:rPr>
+          <w:sz w:val="32"/>
+          <w:szCs w:val="32"/>
+        </w:rPr>
+      </w:pPr>
+      <w:r>
+        <w:rPr>
+          <w:b/>
+          <w:bCs/>
+          <w:sz w:val="32"/>
+          <w:szCs w:val="32"/>
+          <w:rtl/>
+        </w:rPr>
+        <w:t>התוכן המקורי של ה</w:t>
+      </w:r>
+      <w:r>
+        <w:rPr>
+          <w:b/>
+          <w:bCs/>
+          <w:sz w:val="32"/>
+          <w:szCs w:val="32"/>
+        </w:rPr>
+        <w:t>-Hushhh (</w:t>
+      </w:r>
+      <w:r>
+        <w:rPr>
+          <w:b/>
+          <w:bCs/>
+          <w:sz w:val="32"/>
+          <w:szCs w:val="32"/>
+          <w:rtl/>
+        </w:rPr>
+        <w:t>הטקסט או השמע</w:t>
+      </w:r>
+      <w:r>
+        <w:rPr>
+          <w:b/>
+          <w:bCs/>
+          <w:sz w:val="32"/>
+          <w:szCs w:val="32"/>
+        </w:rPr>
+        <w:t>):</w:t>
+      </w:r>
+      <w:r>
+        <w:rPr>
+          <w:sz w:val="32"/>
+          <w:szCs w:val="32"/>
+        </w:rPr>
+        <w:t> </w:t>
+      </w:r>
+      <w:r>
+        <w:rPr>
+          <w:sz w:val="32"/>
+          <w:szCs w:val="32"/>
+          <w:rtl/>
+        </w:rPr>
+        <w:t>ברגע שהתרחקת, מנגנון הבדיקה של </w:t>
+      </w:r>
+      <w:r>
+        <w:rPr>
+          <w:sz w:val="32"/>
+          <w:szCs w:val="32"/>
+        </w:rPr>
+        <w:t xml:space="preserve">SecretCard (isInRange) </w:t>
+      </w:r>
+      <w:r>
+        <w:rPr>
+          <w:sz w:val="32"/>
+          <w:szCs w:val="32"/>
+          <w:rtl/>
+        </w:rPr>
+        <w:t>יזהה שאתה מחוץ לרדיוס. התוכן מיד יחזור להיות מטושטש/נעול, ויוצג לך המרחק</w:t>
+      </w:r>
+      <w:r>
+        <w:rPr>
+          <w:sz w:val="32"/>
+          <w:szCs w:val="32"/>
+        </w:rPr>
+        <w:t xml:space="preserve"> ("XX meters away"). </w:t>
+      </w:r>
+      <w:r>
+        <w:rPr>
+          <w:sz w:val="32"/>
+          <w:szCs w:val="32"/>
+          <w:rtl/>
+        </w:rPr>
+        <w:t>הקוד לא מאפשר גישה לתוכן מרחוק</w:t>
+      </w:r>
+      <w:r>
+        <w:rPr>
+          <w:sz w:val="32"/>
+          <w:szCs w:val="32"/>
+        </w:rPr>
+        <w:t>, </w:t>
+      </w:r>
+      <w:r>
+        <w:rPr>
+          <w:b/>
+          <w:bCs/>
+          <w:sz w:val="32"/>
+          <w:szCs w:val="32"/>
+          <w:rtl/>
+        </w:rPr>
+        <w:t>אלא אם כן פעלת באחת משתי דרכים</w:t>
+      </w:r>
+      <w:r>
+        <w:rPr>
+          <w:b/>
+          <w:bCs/>
+          <w:sz w:val="32"/>
+          <w:szCs w:val="32"/>
+        </w:rPr>
+        <w:t>:</w:t>
+      </w:r>
+    </w:p>
+    <w:p>
+      <w:pPr>
+        <w:pStyle w:val="ae"/>
+        <w:numPr>
+          <w:ilvl w:val="0"/>
+          <w:numId w:val="2"/>
+        </w:numPr>
+        <w:bidi/>
+        <w:rPr>
+          <w:sz w:val="32"/>
+          <w:szCs w:val="32"/>
+        </w:rPr>
+      </w:pPr>
+      <w:r>
+        <w:rPr>
+          <w:sz w:val="32"/>
+          <w:szCs w:val="32"/>
+          <w:rtl/>
+        </w:rPr>
+        <w:t>לחצת על כפתור ה"שמירה</w:t>
+      </w:r>
+      <w:r>
+        <w:rPr>
+          <w:sz w:val="32"/>
+          <w:szCs w:val="32"/>
+        </w:rPr>
+        <w:t xml:space="preserve">" (Save) </w:t>
+      </w:r>
+      <w:r>
+        <w:rPr>
+          <w:sz w:val="32"/>
+          <w:szCs w:val="32"/>
+          <w:rtl/>
+        </w:rPr>
+        <w:t>כשהיית קרוב, ואז הוא נכנס למערך </w:t>
+      </w:r>
+      <w:r>
+        <w:rPr>
+          <w:sz w:val="32"/>
+          <w:szCs w:val="32"/>
+        </w:rPr>
+        <w:t>savedSecretIds </w:t>
+      </w:r>
+      <w:r>
+        <w:rPr>
+          <w:sz w:val="32"/>
+          <w:szCs w:val="32"/>
+          <w:rtl/>
+        </w:rPr>
+        <w:t>שלך (מה שעוקף את בדיקת המרחק)</w:t>
+      </w:r>
+      <w:r>
+        <w:rPr>
+          <w:sz w:val="32"/>
+          <w:szCs w:val="32"/>
+        </w:rPr>
+        <w:t>.</w:t>
+      </w:r>
+    </w:p>
+    <w:p>
+      <w:pPr>
+        <w:pStyle w:val="ae"/>
+        <w:numPr>
+          <w:ilvl w:val="0"/>
+          <w:numId w:val="2"/>
+        </w:numPr>
+        <w:bidi/>
+        <w:rPr>
+          <w:sz w:val="32"/>
+          <w:szCs w:val="32"/>
+        </w:rPr>
+      </w:pPr>
+      <w:r>
+        <w:rPr>
+          <w:sz w:val="32"/>
+          <w:szCs w:val="32"/>
+          <w:rtl/>
+        </w:rPr>
+        <w:t>מדובר ב</w:t>
+      </w:r>
+      <w:r>
+        <w:rPr>
+          <w:sz w:val="32"/>
+          <w:szCs w:val="32"/>
+        </w:rPr>
+        <w:t xml:space="preserve">-Hushhh </w:t>
+      </w:r>
+      <w:r>
+        <w:rPr>
+          <w:sz w:val="32"/>
+          <w:szCs w:val="32"/>
+          <w:rtl/>
+        </w:rPr>
+        <w:t>קבוצתי שאתה היית אחד מהאנשים שעזרו לפתוח אותו. במקרה כזה, ה</w:t>
+      </w:r>
+      <w:r>
+        <w:rPr>
+          <w:sz w:val="32"/>
+          <w:szCs w:val="32"/>
+        </w:rPr>
+        <w:t xml:space="preserve">-UID </w:t>
+      </w:r>
+      <w:r>
+        <w:rPr>
+          <w:sz w:val="32"/>
+          <w:szCs w:val="32"/>
+          <w:rtl/>
+        </w:rPr>
+        <w:t>שלך שמור במערך שנקרא </w:t>
+      </w:r>
+      <w:r>
+        <w:rPr>
+          <w:sz w:val="32"/>
+          <w:szCs w:val="32"/>
+        </w:rPr>
+        <w:t>unlockedBy </w:t>
+      </w:r>
+      <w:r>
+        <w:rPr>
+          <w:sz w:val="32"/>
+          <w:szCs w:val="32"/>
+          <w:rtl/>
+        </w:rPr>
+        <w:t>והקוד מעניק לך גישה לתוכן מכל מקום בעולם לתמיד</w:t>
+      </w:r>
+      <w:r>
+        <w:rPr>
+          <w:sz w:val="32"/>
+          <w:szCs w:val="32"/>
+        </w:rPr>
+        <w:t>.</w:t>
+      </w:r>
+    </w:p>
+    <w:p>
+      <w:pPr>
+        <w:pStyle w:val="ae"/>
+        <w:numPr>
+          <w:ilvl w:val="0"/>
+          <w:numId w:val="3"/>
+        </w:numPr>
+        <w:bidi/>
+        <w:rPr>
+          <w:sz w:val="32"/>
+          <w:szCs w:val="32"/>
+        </w:rPr>
+      </w:pPr>
+      <w:r>
+        <w:rPr>
+          <w:b/>
+          <w:bCs/>
+          <w:sz w:val="32"/>
+          <w:szCs w:val="32"/>
+          <w:rtl/>
+        </w:rPr>
+        <w:t>אזור הדיון והתגובות</w:t>
+      </w:r>
+      <w:r>
+        <w:rPr>
+          <w:b/>
+          <w:bCs/>
+          <w:sz w:val="32"/>
+          <w:szCs w:val="32"/>
+        </w:rPr>
+        <w:t>:</w:t>
+      </w:r>
+      <w:r>
+        <w:rPr>
+          <w:sz w:val="32"/>
+          <w:szCs w:val="32"/>
+        </w:rPr>
+        <w:t> </w:t>
+      </w:r>
+      <w:r>
+        <w:rPr>
+          <w:sz w:val="32"/>
+          <w:szCs w:val="32"/>
+          <w:rtl/>
+        </w:rPr>
+        <w:t>כאן יש התנהגות שנובעת ישירות מהלוגיקה שכתובה ב</w:t>
+      </w:r>
+      <w:r>
+        <w:rPr>
+          <w:sz w:val="32"/>
+          <w:szCs w:val="32"/>
+        </w:rPr>
+        <w:t>-secret_card.dart </w:t>
+      </w:r>
+      <w:r>
+        <w:rPr>
+          <w:sz w:val="32"/>
+          <w:szCs w:val="32"/>
+          <w:rtl/>
+        </w:rPr>
+        <w:t>וב</w:t>
+      </w:r>
+      <w:r>
+        <w:rPr>
+          <w:sz w:val="32"/>
+          <w:szCs w:val="32"/>
+        </w:rPr>
+        <w:t>-app_shell.dart:</w:t>
+      </w:r>
+    </w:p>
+    <w:p>
+      <w:pPr>
+        <w:pStyle w:val="ae"/>
+        <w:numPr>
+          <w:ilvl w:val="0"/>
+          <w:numId w:val="4"/>
+        </w:numPr>
+        <w:bidi/>
+        <w:rPr>
+          <w:sz w:val="32"/>
+          <w:szCs w:val="32"/>
+        </w:rPr>
+      </w:pPr>
+      <w:r>
+        <w:rPr>
+          <w:sz w:val="32"/>
+          <w:szCs w:val="32"/>
+          <w:rtl/>
+        </w:rPr>
+        <w:t>אם סתם תטייל במפה, תראה את ה</w:t>
+      </w:r>
+      <w:r>
+        <w:rPr>
+          <w:sz w:val="32"/>
+          <w:szCs w:val="32"/>
+        </w:rPr>
+        <w:t xml:space="preserve">-Hushhh </w:t>
+      </w:r>
+      <w:r>
+        <w:rPr>
+          <w:sz w:val="32"/>
+          <w:szCs w:val="32"/>
+          <w:rtl/>
+        </w:rPr>
+        <w:t>ממרחק ותלחץ עליו - כפתור התגובות יהיה </w:t>
+      </w:r>
+      <w:r>
+        <w:rPr>
+          <w:b/>
+          <w:bCs/>
+          <w:sz w:val="32"/>
+          <w:szCs w:val="32"/>
+          <w:rtl/>
+        </w:rPr>
+        <w:t>מכובה ואפור</w:t>
+      </w:r>
+      <w:r>
+        <w:rPr>
+          <w:sz w:val="32"/>
+          <w:szCs w:val="32"/>
+          <w:rtl/>
+        </w:rPr>
+        <w:t> </w:t>
+      </w:r>
+      <w:r>
+        <w:rPr>
+          <w:sz w:val="32"/>
+          <w:szCs w:val="32"/>
+        </w:rPr>
+        <w:t xml:space="preserve">(onTap: _revealed ? </w:t>
+      </w:r>
+      <w:proofErr w:type="gramStart"/>
+      <w:r>
+        <w:rPr>
+          <w:sz w:val="32"/>
+          <w:szCs w:val="32"/>
+        </w:rPr>
+        <w:t>... :</w:t>
+      </w:r>
+      <w:proofErr w:type="gramEnd"/>
+      <w:r>
+        <w:rPr>
+          <w:sz w:val="32"/>
+          <w:szCs w:val="32"/>
+        </w:rPr>
+        <w:t xml:space="preserve"> null). </w:t>
+      </w:r>
+      <w:r>
+        <w:rPr>
+          <w:sz w:val="32"/>
+          <w:szCs w:val="32"/>
+          <w:rtl/>
+        </w:rPr>
+        <w:t>לא תוכל לפתוח את הדיון בכלל כי אתה רחוק מדי וה</w:t>
+      </w:r>
+      <w:r>
+        <w:rPr>
+          <w:sz w:val="32"/>
+          <w:szCs w:val="32"/>
+        </w:rPr>
+        <w:t xml:space="preserve">-Hushhh </w:t>
+      </w:r>
+      <w:r>
+        <w:rPr>
+          <w:sz w:val="32"/>
+          <w:szCs w:val="32"/>
+          <w:rtl/>
+        </w:rPr>
+        <w:t>לא פתוח</w:t>
+      </w:r>
+      <w:r>
+        <w:rPr>
+          <w:sz w:val="32"/>
+          <w:szCs w:val="32"/>
+        </w:rPr>
+        <w:t xml:space="preserve"> (_revealed == false).</w:t>
+      </w:r>
+    </w:p>
+    <w:p>
+      <w:pPr>
+        <w:pStyle w:val="ae"/>
+        <w:numPr>
+          <w:ilvl w:val="0"/>
+          <w:numId w:val="4"/>
+        </w:numPr>
+        <w:bidi/>
+        <w:rPr>
+          <w:sz w:val="32"/>
+          <w:szCs w:val="32"/>
+        </w:rPr>
+      </w:pPr>
+      <w:r>
+        <w:rPr>
+          <w:b/>
+          <w:bCs/>
+          <w:sz w:val="32"/>
+          <w:szCs w:val="32"/>
+          <w:rtl/>
+        </w:rPr>
+        <w:t>אבל</w:t>
+      </w:r>
+      <w:r>
+        <w:rPr>
+          <w:b/>
+          <w:bCs/>
+          <w:sz w:val="32"/>
+          <w:szCs w:val="32"/>
+        </w:rPr>
+        <w:t>:</w:t>
+      </w:r>
+      <w:r>
+        <w:rPr>
+          <w:sz w:val="32"/>
+          <w:szCs w:val="32"/>
+        </w:rPr>
+        <w:t> </w:t>
+      </w:r>
+      <w:r>
+        <w:rPr>
+          <w:sz w:val="32"/>
+          <w:szCs w:val="32"/>
+          <w:rtl/>
+        </w:rPr>
+        <w:t>אם מישהו הגיב לך או לדיון, תקבל</w:t>
+      </w:r>
+      <w:r>
+        <w:rPr>
+          <w:sz w:val="32"/>
+          <w:szCs w:val="32"/>
+        </w:rPr>
+        <w:t xml:space="preserve"> Push Notification </w:t>
+      </w:r>
+      <w:r>
+        <w:rPr>
+          <w:sz w:val="32"/>
+          <w:szCs w:val="32"/>
+          <w:rtl/>
+        </w:rPr>
+        <w:t>(התראת פוש). אם תלחץ על ההתראה, הקוד מנווט אותך למסך הסוד ומעביר פרמטר מיוחד</w:t>
+      </w:r>
+      <w:r>
+        <w:rPr>
+          <w:sz w:val="32"/>
+          <w:szCs w:val="32"/>
+        </w:rPr>
+        <w:t xml:space="preserve">: autoOpenComments: true. </w:t>
+      </w:r>
+      <w:r>
+        <w:rPr>
+          <w:sz w:val="32"/>
+          <w:szCs w:val="32"/>
+          <w:rtl/>
+        </w:rPr>
+        <w:t>הפרמטר הזה מכריח את מגירת התגובות לקפוץ מלמטה </w:t>
+      </w:r>
+      <w:r>
+        <w:rPr>
+          <w:i/>
+          <w:iCs/>
+          <w:sz w:val="32"/>
+          <w:szCs w:val="32"/>
+          <w:rtl/>
+        </w:rPr>
+        <w:t>באופן אוטומטי</w:t>
+      </w:r>
+      <w:r>
+        <w:rPr>
+          <w:sz w:val="32"/>
+          <w:szCs w:val="32"/>
+          <w:rtl/>
+        </w:rPr>
+        <w:t> ברגע שהמסך נטען, גם אם אתה מחוץ לרדיוס! מבחינת אבטחה</w:t>
+      </w:r>
+      <w:r>
+        <w:rPr>
+          <w:sz w:val="32"/>
+          <w:szCs w:val="32"/>
+        </w:rPr>
+        <w:t xml:space="preserve"> (Firestore Rules), </w:t>
+      </w:r>
+      <w:r>
+        <w:rPr>
+          <w:sz w:val="32"/>
+          <w:szCs w:val="32"/>
+          <w:rtl/>
+        </w:rPr>
+        <w:t>אין חסימה על קריאת התגובות (בניגוד לתוכן הסוד שמוגן הרמטית), ולכן </w:t>
+      </w:r>
+      <w:r>
+        <w:rPr>
+          <w:b/>
+          <w:bCs/>
+          <w:sz w:val="32"/>
+          <w:szCs w:val="32"/>
+          <w:rtl/>
+        </w:rPr>
+        <w:t>כן תוכל</w:t>
+      </w:r>
+      <w:r>
+        <w:rPr>
+          <w:sz w:val="32"/>
+          <w:szCs w:val="32"/>
+          <w:rtl/>
+        </w:rPr>
+        <w:t xml:space="preserve"> לקרוא את התגובות החדשות ולהמשיך להגיב לדיון דרך </w:t>
+      </w:r>
+      <w:r>
+        <w:rPr>
+          <w:sz w:val="32"/>
+          <w:szCs w:val="32"/>
+          <w:rtl/>
+        </w:rPr>
+        <w:lastRenderedPageBreak/>
+        <w:t>ההתראות שתקבל, כשברקע תראה את ה</w:t>
+      </w:r>
+      <w:r>
+        <w:rPr>
+          <w:sz w:val="32"/>
+          <w:szCs w:val="32"/>
+        </w:rPr>
+        <w:t xml:space="preserve">-Hushhh </w:t>
+      </w:r>
+      <w:r>
+        <w:rPr>
+          <w:sz w:val="32"/>
+          <w:szCs w:val="32"/>
+          <w:rtl/>
+        </w:rPr>
+        <w:t>מטושטש כי התרחקת ממנו</w:t>
+      </w:r>
+      <w:r>
+        <w:rPr>
+          <w:sz w:val="32"/>
+          <w:szCs w:val="32"/>
+        </w:rPr>
+        <w:t>.</w:t>
+      </w:r>
+    </w:p>
+    <w:p>
+      <w:pPr>
+        <w:pStyle w:val="ae"/>
+        <w:bidi/>
+        <w:rPr>
+          <w:sz w:val="32"/>
+          <w:szCs w:val="32"/>
+        </w:rPr>
+      </w:pPr>
+      <w:r>
+        <w:rPr>
+          <w:sz w:val="32"/>
+          <w:szCs w:val="32"/>
+          <w:rtl/>
+        </w:rPr>
+        <w:t>האם זו ההתנהגות שהתכוונת אליה מבחינה מוצרית? אם תרצה שהם יוכלו להגיב מרחוק גם בלי התראה (אם הגיבו בעבר), נצטרך להוסיף רשימת </w:t>
+      </w:r>
+      <w:r>
+        <w:rPr>
+          <w:sz w:val="32"/>
+          <w:szCs w:val="32"/>
+        </w:rPr>
+        <w:t>commentedSecretIds </w:t>
+      </w:r>
+      <w:r>
+        <w:rPr>
+          <w:sz w:val="32"/>
+          <w:szCs w:val="32"/>
+          <w:rtl/>
+        </w:rPr>
+        <w:t>למשתמש. ואם תרצה לחסום אותם לגמרי מדיון מרחוק (אפילו דרך התראות), אפשר לחסום את זה בקוד</w:t>
+      </w:r>
+      <w:r>
+        <w:rPr>
+          <w:sz w:val="32"/>
+          <w:szCs w:val="32"/>
+        </w:rPr>
+        <w:t>.</w:t>
+      </w:r>
     </w:p>
     <w:p>
       <w:pPr>
@@ -1433,6 +2152,547 @@
     </w:sectPr>
   </w:body>
 </w:document>
+</file>
+
+<file path=word/numbering.xml><?xml version="1.0" encoding="utf-8"?>
+<w:numbering xmlns:wpc="http://schemas.microsoft.com/office/word/2010/wordprocessingCanvas" xmlns:cx="http://schemas.microsoft.com/office/drawing/2014/chartex" xmlns:cx1="http://schemas.microsoft.com/office/drawing/2015/9/8/chartex" xmlns:cx2="http://schemas.microsoft.com/office/drawing/2015/10/21/chartex" xmlns:cx3="http://schemas.microsoft.com/office/drawing/2016/5/9/chartex" xmlns:cx4="http://schemas.microsoft.com/office/drawing/2016/5/10/chartex" xmlns:cx5="http://schemas.microsoft.com/office/drawing/2016/5/11/chartex" xmlns:cx6="http://schemas.microsoft.com/office/drawing/2016/5/12/chartex" xmlns:cx7="http://schemas.microsoft.com/office/drawing/2016/5/13/chartex" xmlns:cx8="http://schemas.microsoft.com/office/drawing/2016/5/14/chartex" xmlns:mc="http://schemas.openxmlformats.org/markup-compatibility/2006" xmlns:aink="http://schemas.microsoft.com/office/drawing/2016/ink" xmlns:am3d="http://schemas.microsoft.com/office/drawing/2017/model3d" xmlns:o="urn:schemas-microsoft-com:office:office" xmlns:oel="http://schemas.microsoft.com/office/2019/extlst" xmlns:r="http://schemas.openxmlformats.org/officeDocument/2006/relationships" xmlns:m="http://schemas.openxmlformats.org/officeDocument/2006/math" xmlns:v="urn:schemas-microsoft-com:vml" xmlns:wp14="http://schemas.microsoft.com/office/word/2010/wordprocessingDrawing" xmlns:wp="http://schemas.openxmlformats.org/drawingml/2006/wordprocessingDrawing" xmlns:w10="urn:schemas-microsoft-com:office:word" xmlns:w="http://schemas.openxmlformats.org/wordprocessingml/2006/main" xmlns:w14="http://schemas.microsoft.com/office/word/2010/wordml" xmlns:w15="http://schemas.microsoft.com/office/word/2012/wordml" xmlns:w16cex="http://schemas.microsoft.com/office/word/2018/wordml/cex" xmlns:w16cid="http://schemas.microsoft.com/office/word/2016/wordml/cid" xmlns:w16="http://schemas.microsoft.com/office/word/2018/wordml" xmlns:w16sdtdh="http://schemas.microsoft.com/office/word/2020/wordml/sdtdatahash" xmlns:w16se="http://schemas.microsoft.com/office/word/2015/wordml/symex" xmlns:wpg="http://schemas.microsoft.com/office/word/2010/wordprocessingGroup" xmlns:wpi="http://schemas.microsoft.com/office/word/2010/wordprocessingInk" xmlns:wne="http://schemas.microsoft.com/office/word/2006/wordml" xmlns:wps="http://schemas.microsoft.com/office/word/2010/wordprocessingShape" mc:Ignorable="w14 w15 w16se w16cid w16 w16cex w16sdtdh wp14">
+  <w:abstractNum w:abstractNumId="0" w15:restartNumberingAfterBreak="0">
+    <w:nsid w:val="2EEC5047"/>
+    <w:multiLevelType w:val="multilevel"/>
+    <w:tmpl w:val="E318D516"/>
+    <w:lvl w:ilvl="0">
+      <w:start w:val="1"/>
+      <w:numFmt w:val="bullet"/>
+      <w:lvlText w:val=""/>
+      <w:lvlJc w:val="left"/>
+      <w:pPr>
+        <w:tabs>
+          <w:tab w:val="num" w:pos="720"/>
+        </w:tabs>
+        <w:ind w:left="720" w:hanging="360"/>
+      </w:pPr>
+      <w:rPr>
+        <w:rFonts w:ascii="Symbol" w:hAnsi="Symbol" w:hint="default"/>
+        <w:sz w:val="20"/>
+      </w:rPr>
+    </w:lvl>
+    <w:lvl w:ilvl="1" w:tentative="1">
+      <w:start w:val="1"/>
+      <w:numFmt w:val="bullet"/>
+      <w:lvlText w:val=""/>
+      <w:lvlJc w:val="left"/>
+      <w:pPr>
+        <w:tabs>
+          <w:tab w:val="num" w:pos="1440"/>
+        </w:tabs>
+        <w:ind w:left="1440" w:hanging="360"/>
+      </w:pPr>
+      <w:rPr>
+        <w:rFonts w:ascii="Symbol" w:hAnsi="Symbol" w:hint="default"/>
+        <w:sz w:val="20"/>
+      </w:rPr>
+    </w:lvl>
+    <w:lvl w:ilvl="2" w:tentative="1">
+      <w:start w:val="1"/>
+      <w:numFmt w:val="bullet"/>
+      <w:lvlText w:val=""/>
+      <w:lvlJc w:val="left"/>
+      <w:pPr>
+        <w:tabs>
+          <w:tab w:val="num" w:pos="2160"/>
+        </w:tabs>
+        <w:ind w:left="2160" w:hanging="360"/>
+      </w:pPr>
+      <w:rPr>
+        <w:rFonts w:ascii="Symbol" w:hAnsi="Symbol" w:hint="default"/>
+        <w:sz w:val="20"/>
+      </w:rPr>
+    </w:lvl>
+    <w:lvl w:ilvl="3" w:tentative="1">
+      <w:start w:val="1"/>
+      <w:numFmt w:val="bullet"/>
+      <w:lvlText w:val=""/>
+      <w:lvlJc w:val="left"/>
+      <w:pPr>
+        <w:tabs>
+          <w:tab w:val="num" w:pos="2880"/>
+        </w:tabs>
+        <w:ind w:left="2880" w:hanging="360"/>
+      </w:pPr>
+      <w:rPr>
+        <w:rFonts w:ascii="Symbol" w:hAnsi="Symbol" w:hint="default"/>
+        <w:sz w:val="20"/>
+      </w:rPr>
+    </w:lvl>
+    <w:lvl w:ilvl="4" w:tentative="1">
+      <w:start w:val="1"/>
+      <w:numFmt w:val="bullet"/>
+      <w:lvlText w:val=""/>
+      <w:lvlJc w:val="left"/>
+      <w:pPr>
+        <w:tabs>
+          <w:tab w:val="num" w:pos="3600"/>
+        </w:tabs>
+        <w:ind w:left="3600" w:hanging="360"/>
+      </w:pPr>
+      <w:rPr>
+        <w:rFonts w:ascii="Symbol" w:hAnsi="Symbol" w:hint="default"/>
+        <w:sz w:val="20"/>
+      </w:rPr>
+    </w:lvl>
+    <w:lvl w:ilvl="5" w:tentative="1">
+      <w:start w:val="1"/>
+      <w:numFmt w:val="bullet"/>
+      <w:lvlText w:val=""/>
+      <w:lvlJc w:val="left"/>
+      <w:pPr>
+        <w:tabs>
+          <w:tab w:val="num" w:pos="4320"/>
+        </w:tabs>
+        <w:ind w:left="4320" w:hanging="360"/>
+      </w:pPr>
+      <w:rPr>
+        <w:rFonts w:ascii="Symbol" w:hAnsi="Symbol" w:hint="default"/>
+        <w:sz w:val="20"/>
+      </w:rPr>
+    </w:lvl>
+    <w:lvl w:ilvl="6" w:tentative="1">
+      <w:start w:val="1"/>
+      <w:numFmt w:val="bullet"/>
+      <w:lvlText w:val=""/>
+      <w:lvlJc w:val="left"/>
+      <w:pPr>
+        <w:tabs>
+          <w:tab w:val="num" w:pos="5040"/>
+        </w:tabs>
+        <w:ind w:left="5040" w:hanging="360"/>
+      </w:pPr>
+      <w:rPr>
+        <w:rFonts w:ascii="Symbol" w:hAnsi="Symbol" w:hint="default"/>
+        <w:sz w:val="20"/>
+      </w:rPr>
+    </w:lvl>
+    <w:lvl w:ilvl="7" w:tentative="1">
+      <w:start w:val="1"/>
+      <w:numFmt w:val="bullet"/>
+      <w:lvlText w:val=""/>
+      <w:lvlJc w:val="left"/>
+      <w:pPr>
+        <w:tabs>
+          <w:tab w:val="num" w:pos="5760"/>
+        </w:tabs>
+        <w:ind w:left="5760" w:hanging="360"/>
+      </w:pPr>
+      <w:rPr>
+        <w:rFonts w:ascii="Symbol" w:hAnsi="Symbol" w:hint="default"/>
+        <w:sz w:val="20"/>
+      </w:rPr>
+    </w:lvl>
+    <w:lvl w:ilvl="8" w:tentative="1">
+      <w:start w:val="1"/>
+      <w:numFmt w:val="bullet"/>
+      <w:lvlText w:val=""/>
+      <w:lvlJc w:val="left"/>
+      <w:pPr>
+        <w:tabs>
+          <w:tab w:val="num" w:pos="6480"/>
+        </w:tabs>
+        <w:ind w:left="6480" w:hanging="360"/>
+      </w:pPr>
+      <w:rPr>
+        <w:rFonts w:ascii="Symbol" w:hAnsi="Symbol" w:hint="default"/>
+        <w:sz w:val="20"/>
+      </w:rPr>
+    </w:lvl>
+  </w:abstractNum>
+  <w:abstractNum w:abstractNumId="1" w15:restartNumberingAfterBreak="0">
+    <w:nsid w:val="3AE9420C"/>
+    <w:multiLevelType w:val="multilevel"/>
+    <w:tmpl w:val="22FECD1C"/>
+    <w:lvl w:ilvl="0">
+      <w:start w:val="1"/>
+      <w:numFmt w:val="bullet"/>
+      <w:lvlText w:val=""/>
+      <w:lvlJc w:val="left"/>
+      <w:pPr>
+        <w:tabs>
+          <w:tab w:val="num" w:pos="720"/>
+        </w:tabs>
+        <w:ind w:left="720" w:hanging="360"/>
+      </w:pPr>
+      <w:rPr>
+        <w:rFonts w:ascii="Symbol" w:hAnsi="Symbol" w:hint="default"/>
+        <w:sz w:val="20"/>
+      </w:rPr>
+    </w:lvl>
+    <w:lvl w:ilvl="1" w:tentative="1">
+      <w:start w:val="1"/>
+      <w:numFmt w:val="bullet"/>
+      <w:lvlText w:val=""/>
+      <w:lvlJc w:val="left"/>
+      <w:pPr>
+        <w:tabs>
+          <w:tab w:val="num" w:pos="1440"/>
+        </w:tabs>
+        <w:ind w:left="1440" w:hanging="360"/>
+      </w:pPr>
+      <w:rPr>
+        <w:rFonts w:ascii="Symbol" w:hAnsi="Symbol" w:hint="default"/>
+        <w:sz w:val="20"/>
+      </w:rPr>
+    </w:lvl>
+    <w:lvl w:ilvl="2" w:tentative="1">
+      <w:start w:val="1"/>
+      <w:numFmt w:val="bullet"/>
+      <w:lvlText w:val=""/>
+      <w:lvlJc w:val="left"/>
+      <w:pPr>
+        <w:tabs>
+          <w:tab w:val="num" w:pos="2160"/>
+        </w:tabs>
+        <w:ind w:left="2160" w:hanging="360"/>
+      </w:pPr>
+      <w:rPr>
+        <w:rFonts w:ascii="Symbol" w:hAnsi="Symbol" w:hint="default"/>
+        <w:sz w:val="20"/>
+      </w:rPr>
+    </w:lvl>
+    <w:lvl w:ilvl="3" w:tentative="1">
+      <w:start w:val="1"/>
+      <w:numFmt w:val="bullet"/>
+      <w:lvlText w:val=""/>
+      <w:lvlJc w:val="left"/>
+      <w:pPr>
+        <w:tabs>
+          <w:tab w:val="num" w:pos="2880"/>
+        </w:tabs>
+        <w:ind w:left="2880" w:hanging="360"/>
+      </w:pPr>
+      <w:rPr>
+        <w:rFonts w:ascii="Symbol" w:hAnsi="Symbol" w:hint="default"/>
+        <w:sz w:val="20"/>
+      </w:rPr>
+    </w:lvl>
+    <w:lvl w:ilvl="4" w:tentative="1">
+      <w:start w:val="1"/>
+      <w:numFmt w:val="bullet"/>
+      <w:lvlText w:val=""/>
+      <w:lvlJc w:val="left"/>
+      <w:pPr>
+        <w:tabs>
+          <w:tab w:val="num" w:pos="3600"/>
+        </w:tabs>
+        <w:ind w:left="3600" w:hanging="360"/>
+      </w:pPr>
+      <w:rPr>
+        <w:rFonts w:ascii="Symbol" w:hAnsi="Symbol" w:hint="default"/>
+        <w:sz w:val="20"/>
+      </w:rPr>
+    </w:lvl>
+    <w:lvl w:ilvl="5" w:tentative="1">
+      <w:start w:val="1"/>
+      <w:numFmt w:val="bullet"/>
+      <w:lvlText w:val=""/>
+      <w:lvlJc w:val="left"/>
+      <w:pPr>
+        <w:tabs>
+          <w:tab w:val="num" w:pos="4320"/>
+        </w:tabs>
+        <w:ind w:left="4320" w:hanging="360"/>
+      </w:pPr>
+      <w:rPr>
+        <w:rFonts w:ascii="Symbol" w:hAnsi="Symbol" w:hint="default"/>
+        <w:sz w:val="20"/>
+      </w:rPr>
+    </w:lvl>
+    <w:lvl w:ilvl="6" w:tentative="1">
+      <w:start w:val="1"/>
+      <w:numFmt w:val="bullet"/>
+      <w:lvlText w:val=""/>
+      <w:lvlJc w:val="left"/>
+      <w:pPr>
+        <w:tabs>
+          <w:tab w:val="num" w:pos="5040"/>
+        </w:tabs>
+        <w:ind w:left="5040" w:hanging="360"/>
+      </w:pPr>
+      <w:rPr>
+        <w:rFonts w:ascii="Symbol" w:hAnsi="Symbol" w:hint="default"/>
+        <w:sz w:val="20"/>
+      </w:rPr>
+    </w:lvl>
+    <w:lvl w:ilvl="7" w:tentative="1">
+      <w:start w:val="1"/>
+      <w:numFmt w:val="bullet"/>
+      <w:lvlText w:val=""/>
+      <w:lvlJc w:val="left"/>
+      <w:pPr>
+        <w:tabs>
+          <w:tab w:val="num" w:pos="5760"/>
+        </w:tabs>
+        <w:ind w:left="5760" w:hanging="360"/>
+      </w:pPr>
+      <w:rPr>
+        <w:rFonts w:ascii="Symbol" w:hAnsi="Symbol" w:hint="default"/>
+        <w:sz w:val="20"/>
+      </w:rPr>
+    </w:lvl>
+    <w:lvl w:ilvl="8" w:tentative="1">
+      <w:start w:val="1"/>
+      <w:numFmt w:val="bullet"/>
+      <w:lvlText w:val=""/>
+      <w:lvlJc w:val="left"/>
+      <w:pPr>
+        <w:tabs>
+          <w:tab w:val="num" w:pos="6480"/>
+        </w:tabs>
+        <w:ind w:left="6480" w:hanging="360"/>
+      </w:pPr>
+      <w:rPr>
+        <w:rFonts w:ascii="Symbol" w:hAnsi="Symbol" w:hint="default"/>
+        <w:sz w:val="20"/>
+      </w:rPr>
+    </w:lvl>
+  </w:abstractNum>
+  <w:abstractNum w:abstractNumId="2" w15:restartNumberingAfterBreak="0">
+    <w:nsid w:val="3B493234"/>
+    <w:multiLevelType w:val="multilevel"/>
+    <w:tmpl w:val="4A10BA6A"/>
+    <w:lvl w:ilvl="0">
+      <w:start w:val="1"/>
+      <w:numFmt w:val="decimal"/>
+      <w:lvlText w:val="%1."/>
+      <w:lvlJc w:val="left"/>
+      <w:pPr>
+        <w:tabs>
+          <w:tab w:val="num" w:pos="720"/>
+        </w:tabs>
+        <w:ind w:left="720" w:hanging="360"/>
+      </w:pPr>
+    </w:lvl>
+    <w:lvl w:ilvl="1" w:tentative="1">
+      <w:start w:val="1"/>
+      <w:numFmt w:val="decimal"/>
+      <w:lvlText w:val="%2."/>
+      <w:lvlJc w:val="left"/>
+      <w:pPr>
+        <w:tabs>
+          <w:tab w:val="num" w:pos="1440"/>
+        </w:tabs>
+        <w:ind w:left="1440" w:hanging="360"/>
+      </w:pPr>
+    </w:lvl>
+    <w:lvl w:ilvl="2" w:tentative="1">
+      <w:start w:val="1"/>
+      <w:numFmt w:val="decimal"/>
+      <w:lvlText w:val="%3."/>
+      <w:lvlJc w:val="left"/>
+      <w:pPr>
+        <w:tabs>
+          <w:tab w:val="num" w:pos="2160"/>
+        </w:tabs>
+        <w:ind w:left="2160" w:hanging="360"/>
+      </w:pPr>
+    </w:lvl>
+    <w:lvl w:ilvl="3" w:tentative="1">
+      <w:start w:val="1"/>
+      <w:numFmt w:val="decimal"/>
+      <w:lvlText w:val="%4."/>
+      <w:lvlJc w:val="left"/>
+      <w:pPr>
+        <w:tabs>
+          <w:tab w:val="num" w:pos="2880"/>
+        </w:tabs>
+        <w:ind w:left="2880" w:hanging="360"/>
+      </w:pPr>
+    </w:lvl>
+    <w:lvl w:ilvl="4" w:tentative="1">
+      <w:start w:val="1"/>
+      <w:numFmt w:val="decimal"/>
+      <w:lvlText w:val="%5."/>
+      <w:lvlJc w:val="left"/>
+      <w:pPr>
+        <w:tabs>
+          <w:tab w:val="num" w:pos="3600"/>
+        </w:tabs>
+        <w:ind w:left="3600" w:hanging="360"/>
+      </w:pPr>
+    </w:lvl>
+    <w:lvl w:ilvl="5" w:tentative="1">
+      <w:start w:val="1"/>
+      <w:numFmt w:val="decimal"/>
+      <w:lvlText w:val="%6."/>
+      <w:lvlJc w:val="left"/>
+      <w:pPr>
+        <w:tabs>
+          <w:tab w:val="num" w:pos="4320"/>
+        </w:tabs>
+        <w:ind w:left="4320" w:hanging="360"/>
+      </w:pPr>
+    </w:lvl>
+    <w:lvl w:ilvl="6" w:tentative="1">
+      <w:start w:val="1"/>
+      <w:numFmt w:val="decimal"/>
+      <w:lvlText w:val="%7."/>
+      <w:lvlJc w:val="left"/>
+      <w:pPr>
+        <w:tabs>
+          <w:tab w:val="num" w:pos="5040"/>
+        </w:tabs>
+        <w:ind w:left="5040" w:hanging="360"/>
+      </w:pPr>
+    </w:lvl>
+    <w:lvl w:ilvl="7" w:tentative="1">
+      <w:start w:val="1"/>
+      <w:numFmt w:val="decimal"/>
+      <w:lvlText w:val="%8."/>
+      <w:lvlJc w:val="left"/>
+      <w:pPr>
+        <w:tabs>
+          <w:tab w:val="num" w:pos="5760"/>
+        </w:tabs>
+        <w:ind w:left="5760" w:hanging="360"/>
+      </w:pPr>
+    </w:lvl>
+    <w:lvl w:ilvl="8" w:tentative="1">
+      <w:start w:val="1"/>
+      <w:numFmt w:val="decimal"/>
+      <w:lvlText w:val="%9."/>
+      <w:lvlJc w:val="left"/>
+      <w:pPr>
+        <w:tabs>
+          <w:tab w:val="num" w:pos="6480"/>
+        </w:tabs>
+        <w:ind w:left="6480" w:hanging="360"/>
+      </w:pPr>
+    </w:lvl>
+  </w:abstractNum>
+  <w:abstractNum w:abstractNumId="3" w15:restartNumberingAfterBreak="0">
+    <w:nsid w:val="6CC46BA6"/>
+    <w:multiLevelType w:val="multilevel"/>
+    <w:tmpl w:val="1A348BF2"/>
+    <w:lvl w:ilvl="0">
+      <w:start w:val="2"/>
+      <w:numFmt w:val="decimal"/>
+      <w:lvlText w:val="%1."/>
+      <w:lvlJc w:val="left"/>
+      <w:pPr>
+        <w:tabs>
+          <w:tab w:val="num" w:pos="720"/>
+        </w:tabs>
+        <w:ind w:left="720" w:hanging="360"/>
+      </w:pPr>
+    </w:lvl>
+    <w:lvl w:ilvl="1" w:tentative="1">
+      <w:start w:val="1"/>
+      <w:numFmt w:val="decimal"/>
+      <w:lvlText w:val="%2."/>
+      <w:lvlJc w:val="left"/>
+      <w:pPr>
+        <w:tabs>
+          <w:tab w:val="num" w:pos="1440"/>
+        </w:tabs>
+        <w:ind w:left="1440" w:hanging="360"/>
+      </w:pPr>
+    </w:lvl>
+    <w:lvl w:ilvl="2" w:tentative="1">
+      <w:start w:val="1"/>
+      <w:numFmt w:val="decimal"/>
+      <w:lvlText w:val="%3."/>
+      <w:lvlJc w:val="left"/>
+      <w:pPr>
+        <w:tabs>
+          <w:tab w:val="num" w:pos="2160"/>
+        </w:tabs>
+        <w:ind w:left="2160" w:hanging="360"/>
+      </w:pPr>
+    </w:lvl>
+    <w:lvl w:ilvl="3" w:tentative="1">
+      <w:start w:val="1"/>
+      <w:numFmt w:val="decimal"/>
+      <w:lvlText w:val="%4."/>
+      <w:lvlJc w:val="left"/>
+      <w:pPr>
+        <w:tabs>
+          <w:tab w:val="num" w:pos="2880"/>
+        </w:tabs>
+        <w:ind w:left="2880" w:hanging="360"/>
+      </w:pPr>
+    </w:lvl>
+    <w:lvl w:ilvl="4" w:tentative="1">
+      <w:start w:val="1"/>
+      <w:numFmt w:val="decimal"/>
+      <w:lvlText w:val="%5."/>
+      <w:lvlJc w:val="left"/>
+      <w:pPr>
+        <w:tabs>
+          <w:tab w:val="num" w:pos="3600"/>
+        </w:tabs>
+        <w:ind w:left="3600" w:hanging="360"/>
+      </w:pPr>
+    </w:lvl>
+    <w:lvl w:ilvl="5" w:tentative="1">
+      <w:start w:val="1"/>
+      <w:numFmt w:val="decimal"/>
+      <w:lvlText w:val="%6."/>
+      <w:lvlJc w:val="left"/>
+      <w:pPr>
+        <w:tabs>
+          <w:tab w:val="num" w:pos="4320"/>
+        </w:tabs>
+        <w:ind w:left="4320" w:hanging="360"/>
+      </w:pPr>
+    </w:lvl>
+    <w:lvl w:ilvl="6" w:tentative="1">
+      <w:start w:val="1"/>
+      <w:numFmt w:val="decimal"/>
+      <w:lvlText w:val="%7."/>
+      <w:lvlJc w:val="left"/>
+      <w:pPr>
+        <w:tabs>
+          <w:tab w:val="num" w:pos="5040"/>
+        </w:tabs>
+        <w:ind w:left="5040" w:hanging="360"/>
+      </w:pPr>
+    </w:lvl>
+    <w:lvl w:ilvl="7" w:tentative="1">
+      <w:start w:val="1"/>
+      <w:numFmt w:val="decimal"/>
+      <w:lvlText w:val="%8."/>
+      <w:lvlJc w:val="left"/>
+      <w:pPr>
+        <w:tabs>
+          <w:tab w:val="num" w:pos="5760"/>
+        </w:tabs>
+        <w:ind w:left="5760" w:hanging="360"/>
+      </w:pPr>
+    </w:lvl>
+    <w:lvl w:ilvl="8" w:tentative="1">
+      <w:start w:val="1"/>
+      <w:numFmt w:val="decimal"/>
+      <w:lvlText w:val="%9."/>
+      <w:lvlJc w:val="left"/>
+      <w:pPr>
+        <w:tabs>
+          <w:tab w:val="num" w:pos="6480"/>
+        </w:tabs>
+        <w:ind w:left="6480" w:hanging="360"/>
+      </w:pPr>
+    </w:lvl>
+  </w:abstractNum>
+  <w:num w:numId="1" w16cid:durableId="2060589021">
+    <w:abstractNumId w:val="2"/>
+  </w:num>
+  <w:num w:numId="2" w16cid:durableId="452793601">
+    <w:abstractNumId w:val="1"/>
+  </w:num>
+  <w:num w:numId="3" w16cid:durableId="679312726">
+    <w:abstractNumId w:val="3"/>
+  </w:num>
+  <w:num w:numId="4" w16cid:durableId="898243952">
+    <w:abstractNumId w:val="0"/>
+  </w:num>
+</w:numbering>
 </file>
 
 <file path=word/styles.xml><?xml version="1.0" encoding="utf-8"?>

</xml_diff>